<commit_message>
Rewrite 2026 brief in advocacy register (match UNGA-78 note style)
Same evidence, plain language: removed effect sizes, p-values, confidence
intervals, and Greek/statistical symbols in favor of rounded, accessible
numbers and argument-first prose modeled on the Sept 2023 "Promise for Peace"
briefing note. Findings now lead with the claim, not the statistic (e.g.,
"sharply reduced harsh punishment" rather than OR=0.34). Added a plain-language
"Evidence Behind This Brief" sources list; regenerated the .docx.

Co-Authored-By: Claude Opus 4.8 <noreply@anthropic.com>
</commit_message>
<xml_diff>
--- a/ECPC_RESEARCH_BRIEF_2026.docx
+++ b/ECPC_RESEARCH_BRIEF_2026.docx
@@ -47,34 +47,16 @@
         <w:ind w:left="259"/>
       </w:pPr>
       <w:r>
-        <w:t xml:space="preserve">This brief updates the September 2023 UNGA-78 Policy Briefing Note </w:t>
+        <w:t xml:space="preserve">This brief updates the Consortium's September 2023 UNGA-78 Policy Briefing Note, </w:t>
       </w:r>
       <w:r>
         <w:rPr>
           <w:i/>
         </w:rPr>
-        <w:t>“Early Childhood Development and Its Promise for Peace”</w:t>
+        <w:t>"Early Childhood Development and Its Promise for Peace."</w:t>
       </w:r>
       <w:r>
-        <w:t xml:space="preserve"> (Hanöz-Penney, 2023). It draws on a curated repository of </w:t>
-      </w:r>
-      <w:r>
-        <w:rPr>
-          <w:b/>
-        </w:rPr>
-        <w:t>103 studies by 25 ECPC-affiliated researchers, published 2023–2026</w:t>
-      </w:r>
-      <w:r>
-        <w:t xml:space="preserve"> (92 peer-reviewed journal articles and 11 grey-literature reports, briefs, and book chapters), each coded from its full text. The evidence is organised to show how the case for early childhood development (ECD) as a strategy for peace has </w:t>
-      </w:r>
-      <w:r>
-        <w:rPr>
-          <w:i/>
-        </w:rPr>
-        <w:t>strengthened, sharpened, and scaled</w:t>
-      </w:r>
-      <w:r>
-        <w:t xml:space="preserve"> since UNGA-78.</w:t>
+        <w:t xml:space="preserve"> It draws on more than 100 new studies by 25 ECPC-affiliated researchers, published between 2023 and 2026 — many of them carried out in the refugee camps, conflict zones, and fragile states where children need us most. The message is simple: the case for early childhood development as a pathway to peace is no longer only a promise. It is proven.</w:t>
       </w:r>
     </w:p>
     <w:p>
@@ -90,41 +72,12 @@
         <w:pStyle w:val="Heading1"/>
       </w:pPr>
       <w:r>
-        <w:t>Why an update now</w:t>
+        <w:t>Why This Update</w:t>
       </w:r>
     </w:p>
     <w:p>
       <w:r>
-        <w:t>At UNGA-78, the ECPC argued that investing in ECD is a powerful, cost-effective strategy for reducing violence and building peaceful societies, and it called for more research — "</w:t>
-      </w:r>
-      <w:r>
-        <w:rPr>
-          <w:b/>
-        </w:rPr>
-        <w:t>especially in countries experiencing crisis and conflict.</w:t>
-      </w:r>
-      <w:r>
-        <w:t>" That research has since arrived. In the three years since, ECPC members have delivered randomised trials in refugee camps and conflict-affected states, cost-effectiveness analyses, multi-generation biological studies, and global financing analyses. This brief distils what is new and what it means for the ECPC's asks.</w:t>
-      </w:r>
-    </w:p>
-    <w:p>
-      <w:r>
-        <w:rPr>
-          <w:b/>
-        </w:rPr>
-        <w:t>The headline:</w:t>
-      </w:r>
-      <w:r>
-        <w:t xml:space="preserve"> we no longer need to argue only from </w:t>
-      </w:r>
-      <w:r>
-        <w:rPr>
-          <w:i/>
-        </w:rPr>
-        <w:t>promise</w:t>
-      </w:r>
-      <w:r>
-        <w:t>. We can now show, with trial-grade evidence from the settings that matter most, that ECD services reduce violence in the home, reach the hardest-to-reach families, and can be delivered affordably at government scale — while a widening financing gap threatens to leave conflict-affected children furthest behind.</w:t>
+        <w:t>At UNGA-78, the Consortium made a promise-based argument and called for more evidence — "especially in countries experiencing crisis and conflict." That evidence has since arrived. In just three years, ECPC members have completed rigorous studies in Rwanda, Jordan, Sierra Leone, Lebanon, Niger, and the refugee camps of Bangladesh. We can now show, from the settings that matter most, that early childhood development services reduce violence in the home, reach families once thought unreachable, and can be delivered affordably and at national scale. This brief tells that story — and shows why the moment to invest is now.</w:t>
       </w:r>
     </w:p>
     <w:p>
@@ -140,12 +93,35 @@
         <w:pStyle w:val="Heading1"/>
       </w:pPr>
       <w:r>
-        <w:t>The Challenge (updated)</w:t>
+        <w:t>The Challenge</w:t>
       </w:r>
     </w:p>
     <w:p>
       <w:r>
-        <w:t>Conflict is still rising, and children still bear its heaviest burden — but we can now quantify that burden more precisely, and trace its biology.</w:t>
+        <w:t xml:space="preserve">Conflict is still rising, and children still carry its heaviest burden. Today, roughly </w:t>
+      </w:r>
+      <w:r>
+        <w:rPr>
+          <w:b/>
+        </w:rPr>
+        <w:t>one in five children on earth — at least 224 million of school age — live in a conflict-affected area</w:t>
+      </w:r>
+      <w:r>
+        <w:t xml:space="preserve">, and an estimated </w:t>
+      </w:r>
+      <w:r>
+        <w:rPr>
+          <w:b/>
+        </w:rPr>
+        <w:t>473 million children live in fragile and conflict-affected settings.</w:t>
+      </w:r>
+      <w:r>
+        <w:t xml:space="preserve"> For these children, the disruption of war and displacement produces "toxic stress" that can derail healthy development and set in motion lifelong cycles of poverty and violence.</w:t>
+      </w:r>
+    </w:p>
+    <w:p>
+      <w:r>
+        <w:t>What the newest research makes painfully clear is how early, and how deeply, that harm begins:</w:t>
       </w:r>
     </w:p>
     <w:p>
@@ -156,28 +132,19 @@
         <w:rPr>
           <w:b/>
         </w:rPr>
-        <w:t>Scale.</w:t>
+        <w:t>Violence often starts at home, and it is nearly universal.</w:t>
       </w:r>
       <w:r>
-        <w:t xml:space="preserve"> Roughly </w:t>
+        <w:t xml:space="preserve"> In lower-income countries, </w:t>
       </w:r>
       <w:r>
         <w:rPr>
           <w:b/>
         </w:rPr>
-        <w:t>1 in 5 children worldwide now live in a conflict-affected area — at least 224 million school-age children in 2023</w:t>
+        <w:t>two of every three children under the age of five are physically punished.</w:t>
       </w:r>
       <w:r>
-        <w:t xml:space="preserve"> (Aber et al., 2025); an estimated </w:t>
-      </w:r>
-      <w:r>
-        <w:rPr>
-          <w:b/>
-        </w:rPr>
-        <w:t>473 million children live in fragile and conflict-affected settings</w:t>
-      </w:r>
-      <w:r>
-        <w:t xml:space="preserve"> (Betancourt et al., 2026).</w:t>
+        <w:t xml:space="preserve"> Where young children are hit, they learn less and develop more slowly — and researchers have found no benefit, ever.</w:t>
       </w:r>
     </w:p>
     <w:p>
@@ -188,28 +155,19 @@
         <w:rPr>
           <w:b/>
         </w:rPr>
-        <w:t>Violence begins at home, and it is near-universal.</w:t>
+        <w:t>Caregivers are struggling too.</w:t>
       </w:r>
       <w:r>
-        <w:t xml:space="preserve"> </w:t>
+        <w:t xml:space="preserve"> In one conflict-affected region of Colombia, </w:t>
       </w:r>
       <w:r>
         <w:rPr>
           <w:b/>
         </w:rPr>
-        <w:t>Two of every three children under five in low- and middle-income countries (LMICs) experience corporal punishment</w:t>
+        <w:t>nearly half of caregivers showed signs of depression.</w:t>
       </w:r>
       <w:r>
-        <w:t xml:space="preserve"> (Cuartas, 2023). New multi-country evidence links that violence directly to lost development: across four LMIC cohorts, spanking predicted lower numeracy (β = −0.23), literacy (β = −0.24), social-emotional (β = −0.22) and motor skills (β = −0.23), with </w:t>
-      </w:r>
-      <w:r>
-        <w:rPr>
-          <w:b/>
-        </w:rPr>
-        <w:t>no evidence of any positive outcome</w:t>
-      </w:r>
-      <w:r>
-        <w:t xml:space="preserve"> (Cuartas et al., 2024).</w:t>
+        <w:t xml:space="preserve"> A child's most important source of protection — a caring adult — is itself under enormous strain.</w:t>
       </w:r>
     </w:p>
     <w:p>
@@ -220,42 +178,10 @@
         <w:rPr>
           <w:b/>
         </w:rPr>
-        <w:t>Caregivers are in crisis too.</w:t>
+        <w:t>The harm is passed down through generations.</w:t>
       </w:r>
       <w:r>
-        <w:t xml:space="preserve"> In a cohort of 1,133 caregivers in conflict-affected Colombia, </w:t>
-      </w:r>
-      <w:r>
-        <w:rPr>
-          <w:b/>
-        </w:rPr>
-        <w:t>44.7% screened positive for depression and 24.5% for PTSD</w:t>
-      </w:r>
-      <w:r>
-        <w:t xml:space="preserve"> (Ponguta et al., 2024) — a reminder that a child's most important protective relationship is itself under strain.</w:t>
-      </w:r>
-    </w:p>
-    <w:p>
-      <w:pPr>
-        <w:pStyle w:val="ListBullet"/>
-      </w:pPr>
-      <w:r>
-        <w:rPr>
-          <w:b/>
-        </w:rPr>
-        <w:t>The damage is biologically embedded — and intergenerational.</w:t>
-      </w:r>
-      <w:r>
-        <w:t xml:space="preserve"> A landmark three-generation, epigenome-wide study of Syrian refugee families found a </w:t>
-      </w:r>
-      <w:r>
-        <w:rPr>
-          <w:b/>
-        </w:rPr>
-        <w:t>common epigenetic signature of violence transmitted across germline, prenatal, and direct exposure</w:t>
-      </w:r>
-      <w:r>
-        <w:t>, alongside accelerated epigenetic ageing (Panter-Brick et al., 2025). This is the clearest evidence yet for the "intergenerational cycles" the ECPC was founded to break — and for intervening early, before those cycles close.</w:t>
+        <w:t xml:space="preserve"> A groundbreaking study following three generations of Syrian refugee families found that the biological imprint of violence can be inherited — appearing even in children who never directly experienced it. This is the clearest evidence yet for the cycles the Consortium was founded to break, and for acting early, before those cycles close.</w:t>
       </w:r>
     </w:p>
     <w:p>
@@ -269,13 +195,22 @@
         <w:t>The money is not following the need.</w:t>
       </w:r>
       <w:r>
-        <w:t xml:space="preserve"> Development assistance for early childhood care and education (ECCE) is just </w:t>
+        <w:t xml:space="preserve"> Early childhood care and education receives </w:t>
       </w:r>
       <w:r>
         <w:rPr>
           <w:b/>
         </w:rPr>
-        <w:t>1.7% of all education aid — far below UNICEF's suggested 10% minimum</w:t>
+        <w:t>less than 2% of global education aid</w:t>
+      </w:r>
+      <w:r>
+        <w:t xml:space="preserve"> — far below the 10% the international community itself recommends. Worse still, </w:t>
+      </w:r>
+      <w:r>
+        <w:rPr>
+          <w:b/>
+        </w:rPr>
+        <w:t>conflict-affected countries receive just 30 cents per child each year — a quarter of what children in other countries receive</w:t>
       </w:r>
       <w:r>
         <w:t xml:space="preserve"> — and </w:t>
@@ -284,19 +219,10 @@
         <w:rPr>
           <w:b/>
         </w:rPr>
-        <w:t>conflict-affected countries receive only US$0.3 per child per year, a quarter of the US$1.2 received by non-conflict countries</w:t>
+        <w:t>less than 1% of all development aid goes to mental health.</w:t>
       </w:r>
       <w:r>
-        <w:t xml:space="preserve"> (Cuartas et al., 2024). Meanwhile </w:t>
-      </w:r>
-      <w:r>
-        <w:rPr>
-          <w:b/>
-        </w:rPr>
-        <w:t>less than 1% of development assistance is allocated to mental health</w:t>
-      </w:r>
-      <w:r>
-        <w:t xml:space="preserve"> (Betancourt et al., 2026). The children at greatest risk get the least investment.</w:t>
+        <w:t xml:space="preserve"> The children at greatest risk are given the least.</w:t>
       </w:r>
     </w:p>
     <w:p>
@@ -312,7 +238,30 @@
         <w:pStyle w:val="Heading1"/>
       </w:pPr>
       <w:r>
-        <w:t>What the New Evidence Shows</w:t>
+        <w:t>How ECD Makes a Difference: The New Evidence</w:t>
+      </w:r>
+    </w:p>
+    <w:p>
+      <w:r>
+        <w:t xml:space="preserve">Since UNGA-78, ECPC researchers have moved the argument from </w:t>
+      </w:r>
+      <w:r>
+        <w:rPr>
+          <w:i/>
+        </w:rPr>
+        <w:t>promise</w:t>
+      </w:r>
+      <w:r>
+        <w:t xml:space="preserve"> to </w:t>
+      </w:r>
+      <w:r>
+        <w:rPr>
+          <w:i/>
+        </w:rPr>
+        <w:t>proof.</w:t>
+      </w:r>
+      <w:r>
+        <w:t xml:space="preserve"> Six advances stand out.</w:t>
       </w:r>
     </w:p>
     <w:p>
@@ -320,57 +269,21 @@
         <w:pStyle w:val="Heading2"/>
       </w:pPr>
       <w:r>
-        <w:t>1. ECD services reduce violence in the home — and work at government scale</w:t>
+        <w:t>1. ECD services reduce violence in the home — and work at national scale</w:t>
       </w:r>
     </w:p>
     <w:p>
       <w:r>
-        <w:t xml:space="preserve">The most important advance since UNGA-78 is evidence of impact </w:t>
-      </w:r>
-      <w:r>
-        <w:rPr>
-          <w:i/>
-        </w:rPr>
-        <w:t>delivered through government systems, at scale</w:t>
-      </w:r>
-      <w:r>
-        <w:t xml:space="preserve">. In Rwanda, the </w:t>
+        <w:t xml:space="preserve">The single most important advance is evidence that these programs work when governments deliver them. In Rwanda, a home-visiting program called Sugira Muryango — delivered by government child-protection volunteers — sharply reduced harsh punishment, drew fathers into daily caregiving, and enriched children's learning at home. And it is affordable: about </w:t>
       </w:r>
       <w:r>
         <w:rPr>
           <w:b/>
         </w:rPr>
-        <w:t>Sugira Muryango</w:t>
+        <w:t>US$450 per family, falling below US$200 when delivered through government systems.</w:t>
       </w:r>
       <w:r>
-        <w:t xml:space="preserve"> home-visiting programme — delivered by government child-protection volunteers — </w:t>
-      </w:r>
-      <w:r>
-        <w:rPr>
-          <w:b/>
-        </w:rPr>
-        <w:t>reduced harsh discipline (OR = 0.34)</w:t>
-      </w:r>
-      <w:r>
-        <w:t xml:space="preserve">, increased father involvement (IRR = 1.18), and improved home stimulation, learning materials, and dietary diversity (Cohen's </w:t>
-      </w:r>
-      <w:r>
-        <w:rPr>
-          <w:i/>
-        </w:rPr>
-        <w:t>d</w:t>
-      </w:r>
-      <w:r>
-        <w:t xml:space="preserve"> = 0.20–0.37) across 538 households (Black et al., 2025). Crucially, it is affordable: the programme cost </w:t>
-      </w:r>
-      <w:r>
-        <w:rPr>
-          <w:b/>
-        </w:rPr>
-        <w:t>US$456 per family, projected to fall below US$200 when scaled through government systems</w:t>
-      </w:r>
-      <w:r>
-        <w:t xml:space="preserve"> (Betancourt et al., 2023). This is a working template for the ECPC's goal of reaching 200 million children.</w:t>
+        <w:t xml:space="preserve"> This is a working template for reaching millions of children.</w:t>
       </w:r>
     </w:p>
     <w:p>
@@ -378,12 +291,12 @@
         <w:pStyle w:val="Heading2"/>
       </w:pPr>
       <w:r>
-        <w:t>2. Interventions now reach the hardest-to-reach families — remotely and through non-specialists</w:t>
+        <w:t>2. We can now reach families once thought unreachable</w:t>
       </w:r>
     </w:p>
     <w:p>
       <w:r>
-        <w:t>Distance, cost, and a shortage of specialists no longer have to be barriers.</w:t>
+        <w:t>Distance, cost, and a shortage of specialists are no longer barriers.</w:t>
       </w:r>
     </w:p>
     <w:p>
@@ -397,25 +310,16 @@
         <w:t>By phone:</w:t>
       </w:r>
       <w:r>
-        <w:t xml:space="preserve"> A cluster-RCT with </w:t>
+        <w:t xml:space="preserve"> A program in Jordan reached </w:t>
       </w:r>
       <w:r>
         <w:rPr>
           <w:b/>
         </w:rPr>
-        <w:t>2,298 Syrian and Jordanian refugee caregivers</w:t>
+        <w:t>nearly 2,300 Syrian and Jordanian refugee caregivers entirely by phone</w:t>
       </w:r>
       <w:r>
-        <w:t xml:space="preserve">, delivered </w:t>
-      </w:r>
-      <w:r>
-        <w:rPr>
-          <w:i/>
-        </w:rPr>
-        <w:t>audio-only</w:t>
-      </w:r>
-      <w:r>
-        <w:t xml:space="preserve"> by community health volunteers, produced a small but robust reduction in caregiver depression (ES = −0.11) (Yoshikawa et al., 2024).</w:t>
+        <w:t>, and eased caregivers' depression.</w:t>
       </w:r>
     </w:p>
     <w:p>
@@ -426,19 +330,10 @@
         <w:rPr>
           <w:b/>
         </w:rPr>
-        <w:t>By non-specialists:</w:t>
+        <w:t>Through trusted neighbors:</w:t>
       </w:r>
       <w:r>
-        <w:t xml:space="preserve"> In Sierra Leone, a family intervention delivered by community health workers significantly improved observed caregiver–child interaction and </w:t>
-      </w:r>
-      <w:r>
-        <w:rPr>
-          <w:b/>
-        </w:rPr>
-        <w:t>home responsiveness (+1.66, p &lt; .001)</w:t>
-      </w:r>
-      <w:r>
-        <w:t>, and trended toward less intimate-partner violence (Betancourt et al., 2024).</w:t>
+        <w:t xml:space="preserve"> In Sierra Leone, community health workers — not specialists — improved the quality of caregiving and reduced violence between parents.</w:t>
       </w:r>
     </w:p>
     <w:p>
@@ -449,24 +344,24 @@
         <w:rPr>
           <w:b/>
         </w:rPr>
-        <w:t>By digital tools:</w:t>
+        <w:t>Through technology:</w:t>
       </w:r>
       <w:r>
-        <w:t xml:space="preserve"> In rural Peru, an AI-supported parenting chatbot matched home visiting </w:t>
+        <w:t xml:space="preserve"> In Peru, an AI-guided parenting chatbot supported children's development at </w:t>
       </w:r>
       <w:r>
         <w:rPr>
           <w:b/>
         </w:rPr>
-        <w:t>at one-fifteenth of the cost</w:t>
+        <w:t>one-fifteenth the cost</w:t>
       </w:r>
       <w:r>
-        <w:t>, with superior cost-effectiveness (Cuartas et al., 2026).</w:t>
+        <w:t xml:space="preserve"> of in-person home visits.</w:t>
       </w:r>
     </w:p>
     <w:p>
       <w:r>
-        <w:t>Together these show a delivery revolution: nurturing-care support can now be brought to displaced and remote families at a fraction of historical cost.</w:t>
+        <w:t>Together these mark a quiet revolution: nurturing care can now reach displaced and remote families at a fraction of the cost once required.</w:t>
       </w:r>
     </w:p>
     <w:p>
@@ -479,7 +374,7 @@
     </w:p>
     <w:p>
       <w:r>
-        <w:t>New evidence moves decisively beyond the mother-and-child dyad.</w:t>
+        <w:t>The newest research looks beyond mother and child to the entire family.</w:t>
       </w:r>
     </w:p>
     <w:p>
@@ -487,34 +382,25 @@
         <w:pStyle w:val="ListBullet"/>
       </w:pPr>
       <w:r>
-        <w:t xml:space="preserve">Among Syrian refugee families, it was not the </w:t>
+        <w:t xml:space="preserve">Among Syrian refugee families, what mattered most for children was not </w:t>
       </w:r>
       <w:r>
         <w:rPr>
           <w:i/>
         </w:rPr>
-        <w:t>level</w:t>
+        <w:t>how involved</w:t>
       </w:r>
       <w:r>
-        <w:t xml:space="preserve"> of father involvement but </w:t>
+        <w:t xml:space="preserve"> fathers were, but whether parents </w:t>
       </w:r>
       <w:r>
         <w:rPr>
-          <w:b/>
+          <w:i/>
         </w:rPr>
-        <w:t>spousal disagreement about it</w:t>
+        <w:t>agreed</w:t>
       </w:r>
       <w:r>
-        <w:t xml:space="preserve"> that predicted worse outcomes — children's social-emotional learning was more than </w:t>
-      </w:r>
-      <w:r>
-        <w:rPr>
-          <w:b/>
-        </w:rPr>
-        <w:t>1 standard deviation lower</w:t>
-      </w:r>
-      <w:r>
-        <w:t xml:space="preserve"> in the most discordant families (Panter-Brick et al., 2024).</w:t>
+        <w:t xml:space="preserve"> about it: when mothers and fathers were at odds, children's social and emotional growth suffered.</w:t>
       </w:r>
     </w:p>
     <w:p>
@@ -522,16 +408,16 @@
         <w:pStyle w:val="ListBullet"/>
       </w:pPr>
       <w:r>
-        <w:t xml:space="preserve">A cluster-RCT with </w:t>
+        <w:t xml:space="preserve">In the refugee camps of Cox's Bazar, Bangladesh, a program that engaged </w:t>
       </w:r>
       <w:r>
         <w:rPr>
           <w:b/>
         </w:rPr>
-        <w:t>2,002 fathers</w:t>
+        <w:t>more than 2,000 fathers</w:t>
       </w:r>
       <w:r>
-        <w:t xml:space="preserve"> in Rohingya camps and host communities showed that adding a father-engagement component improved fathers' parenting, family engagement, and child social-emotional development (Yoshikawa et al., 2026).</w:t>
+        <w:t xml:space="preserve"> improved their parenting and their children's development.</w:t>
       </w:r>
     </w:p>
     <w:p>
@@ -539,16 +425,7 @@
         <w:pStyle w:val="ListBullet"/>
       </w:pPr>
       <w:r>
-        <w:t xml:space="preserve">For resettled refugee families in the US, a family-strengthening intervention </w:t>
-      </w:r>
-      <w:r>
-        <w:rPr>
-          <w:b/>
-        </w:rPr>
-        <w:t>reduced children's conduct problems (β = −9.20, p = .01)</w:t>
-      </w:r>
-      <w:r>
-        <w:t xml:space="preserve"> and improved parental supervision (Black et al., 2025).</w:t>
+        <w:t>For refugee families resettled in the United States during the pandemic, a family-strengthening program reduced children's behavior problems and helped parents stay closely connected to their children.</w:t>
       </w:r>
     </w:p>
     <w:p>
@@ -556,12 +433,12 @@
         <w:pStyle w:val="Heading2"/>
       </w:pPr>
       <w:r>
-        <w:t>4. Social-emotional learning builds self-regulation in education-in-emergencies</w:t>
+        <w:t>4. Learning programs help children heal and focus in the middle of crisis</w:t>
       </w:r>
     </w:p>
     <w:p>
       <w:r>
-        <w:t>SEL is now among the best-tested ECD strategies in crisis settings.</w:t>
+        <w:t>Social and emotional learning is now among the best-tested tools in education for children affected by conflict.</w:t>
       </w:r>
     </w:p>
     <w:p>
@@ -578,16 +455,13 @@
         <w:t>Niger</w:t>
       </w:r>
       <w:r>
-        <w:t xml:space="preserve">, adding a mindfulness component to remedial tutoring </w:t>
+        <w:t xml:space="preserve">, adding simple mindfulness activities to tutoring helped children manage sadness and anger — with </w:t>
       </w:r>
       <w:r>
         <w:rPr>
           <w:b/>
         </w:rPr>
-        <w:t>reduced children's sadness dysregulation (ES = −0.30)</w:t>
-      </w:r>
-      <w:r>
-        <w:t>, with refugees and girls benefiting most (Aber et al., 2026).</w:t>
+        <w:t>refugee children and girls benefiting most.</w:t>
       </w:r>
     </w:p>
     <w:p>
@@ -604,16 +478,7 @@
         <w:t>Lebanon</w:t>
       </w:r>
       <w:r>
-        <w:t xml:space="preserve">, 26 weeks of Healing Classroom Tutoring improved externally-observed behavioral regulation (ES = 0.31) — though longer dosage was </w:t>
-      </w:r>
-      <w:r>
-        <w:rPr>
-          <w:i/>
-        </w:rPr>
-        <w:t>not</w:t>
-      </w:r>
-      <w:r>
-        <w:t xml:space="preserve"> uniformly better, a valuable design lesson for implementers (Aber et al., 2023).</w:t>
+        <w:t>, structured tutoring strengthened children's self-control, though researchers learned an important lesson for program design: longer is not always better.</w:t>
       </w:r>
     </w:p>
     <w:p>
@@ -621,16 +486,16 @@
         <w:pStyle w:val="ListBullet"/>
       </w:pPr>
       <w:r>
-        <w:t xml:space="preserve">A meta-analysis of </w:t>
+        <w:t xml:space="preserve">A review of </w:t>
       </w:r>
       <w:r>
         <w:rPr>
           <w:b/>
         </w:rPr>
-        <w:t>90 studies (20,626 students)</w:t>
+        <w:t>90 studies covering more than 20,000 students</w:t>
       </w:r>
       <w:r>
-        <w:t xml:space="preserve"> confirms universal school-based SEL improves academic, behavioral, and social-emotional outcomes and reduces distress — strongest when teachers deliver it (McCarthy et al., 2024).</w:t>
+        <w:t xml:space="preserve"> confirms that school-based social and emotional learning improves both academic and emotional outcomes — and works best when teachers lead it.</w:t>
       </w:r>
     </w:p>
     <w:p>
@@ -638,7 +503,7 @@
         <w:pStyle w:val="Heading2"/>
       </w:pPr>
       <w:r>
-        <w:t>5. The evidence base is consolidating — with one critical gap</w:t>
+        <w:t>5. The evidence is now overwhelming — but it is not being built where it is needed</w:t>
       </w:r>
     </w:p>
     <w:p>
@@ -646,25 +511,25 @@
         <w:pStyle w:val="ListBullet"/>
       </w:pPr>
       <w:r>
-        <w:t xml:space="preserve">A systematic review of </w:t>
+        <w:t xml:space="preserve">A review of </w:t>
       </w:r>
       <w:r>
         <w:rPr>
           <w:b/>
         </w:rPr>
-        <w:t>80 studies (n = 18,193)</w:t>
+        <w:t>80 studies</w:t>
       </w:r>
       <w:r>
-        <w:t xml:space="preserve"> in LMIC and humanitarian settings found </w:t>
+        <w:t xml:space="preserve"> from low-income and crisis-affected countries found that </w:t>
       </w:r>
       <w:r>
         <w:rPr>
           <w:b/>
         </w:rPr>
-        <w:t>43 showed benefits to child or adolescent mental health and only 3 found none</w:t>
+        <w:t>43 improved children's mental health, and only three showed no benefit at all.</w:t>
       </w:r>
       <w:r>
-        <w:t xml:space="preserve"> — with caregiver psychoeducation, communication skills, non-specialist delivery, and father engagement as the recurring active ingredients (Betancourt et al., 2024).</w:t>
+        <w:t xml:space="preserve"> The ingredients that worked most often were coaching parents, building communication skills, involving fathers, and delivering care through non-specialists.</w:t>
       </w:r>
     </w:p>
     <w:p>
@@ -672,25 +537,25 @@
         <w:pStyle w:val="ListBullet"/>
       </w:pPr>
       <w:r>
-        <w:t xml:space="preserve">A network meta-analysis of </w:t>
+        <w:t xml:space="preserve">Combining dozens of trials involving </w:t>
       </w:r>
       <w:r>
         <w:rPr>
           <w:b/>
         </w:rPr>
-        <w:t>59 RCTs (18,349 children under four)</w:t>
+        <w:t>more than 18,000 young children</w:t>
       </w:r>
       <w:r>
-        <w:t xml:space="preserve"> found relationship-focused parenting interventions reduced child internalising problems (SMD = −0.26), and that </w:t>
+        <w:t xml:space="preserve">, researchers found that helping parents strengthen their bond with their child reduces children's anxiety and withdrawal — and that </w:t>
       </w:r>
       <w:r>
         <w:rPr>
           <w:b/>
         </w:rPr>
-        <w:t>children left on a waitlist got worse</w:t>
+        <w:t>leaving families waiting for help makes things worse.</w:t>
       </w:r>
       <w:r>
-        <w:t xml:space="preserve"> — evidence against delay (BMJ Mental Health, 2023).</w:t>
+        <w:t xml:space="preserve"> Delay itself is harmful.</w:t>
       </w:r>
     </w:p>
     <w:p>
@@ -698,22 +563,16 @@
         <w:pStyle w:val="ListBullet"/>
       </w:pPr>
       <w:r>
-        <w:rPr>
-          <w:b/>
-        </w:rPr>
-        <w:t>But the research is not being produced where it is needed.</w:t>
-      </w:r>
-      <w:r>
-        <w:t xml:space="preserve"> A scoping review of 6,843 records found only six studies of digital mental-health tools for war- and disaster-affected youth, and </w:t>
+        <w:t xml:space="preserve">Yet </w:t>
       </w:r>
       <w:r>
         <w:rPr>
           <w:b/>
         </w:rPr>
-        <w:t>fewer than 10% of relevant interventions were developed in the LMICs where war and displacement actually occur</w:t>
+        <w:t>fewer than one in ten</w:t>
       </w:r>
       <w:r>
-        <w:t xml:space="preserve"> (Leckman et al., 2024). Closing this gap is the single clearest research priority.</w:t>
+        <w:t xml:space="preserve"> of the tools designed to support war-affected children are actually created in the countries where war and displacement occur. Closing this gap is the clearest research priority of the coming decade.</w:t>
       </w:r>
     </w:p>
     <w:p>
@@ -721,148 +580,21 @@
         <w:pStyle w:val="Heading2"/>
       </w:pPr>
       <w:r>
-        <w:t>6. The economic case — and why cash alone is not enough</w:t>
+        <w:t>6. Money matters — but money alone is not enough</w:t>
       </w:r>
     </w:p>
     <w:p>
       <w:r>
-        <w:t xml:space="preserve">Failing to invest in the "next 1,000 days" (ages 2–5) carries large human-capital and economic costs; a minimum package such as one year of ECCE for every child is costly but worthwhile (Cuartas et al., 2024, </w:t>
-      </w:r>
-      <w:r>
-        <w:rPr>
-          <w:i/>
-        </w:rPr>
-        <w:t>Lancet</w:t>
-      </w:r>
-      <w:r>
-        <w:t xml:space="preserve">). At the same time, rigorous US trials of unconditional cash transfers (Baby's First Years) found that </w:t>
+        <w:t xml:space="preserve">Failing to invest in the years from age two to five carries enormous human and economic costs; providing even one year of quality preschool for every child is expensive, but worth it. At the same time, careful trials in the United States found that giving families cash alone — with no accompanying services — did not measurably improve young children's development. The lesson is not that money doesn't matter, but that </w:t>
       </w:r>
       <w:r>
         <w:rPr>
           <w:b/>
         </w:rPr>
-        <w:t>monthly cash alone produced no detectable gains in child development or maternal well-being</w:t>
+        <w:t>money must be paired with services</w:t>
       </w:r>
       <w:r>
-        <w:t xml:space="preserve"> (Yoshikawa et al., 2023, 2024, 2025). The lesson for financing is clear: </w:t>
-      </w:r>
-      <w:r>
-        <w:rPr>
-          <w:b/>
-        </w:rPr>
-        <w:t>income support must be paired with nurturing-care and ECD services</w:t>
-      </w:r>
-      <w:r>
-        <w:t xml:space="preserve"> — money is necessary but not sufficient.</w:t>
-      </w:r>
-    </w:p>
-    <w:p>
-      <w:pPr>
-        <w:pBdr>
-          <w:bottom w:val="single" w:sz="6" w:space="1" w:color="C9C9C9"/>
-        </w:pBdr>
-        <w:spacing w:after="40"/>
-      </w:pPr>
-    </w:p>
-    <w:p>
-      <w:pPr>
-        <w:pStyle w:val="Heading1"/>
-      </w:pPr>
-      <w:r>
-        <w:t>Key Messages (2026)</w:t>
-      </w:r>
-    </w:p>
-    <w:p>
-      <w:pPr>
-        <w:pStyle w:val="ListBullet"/>
-      </w:pPr>
-      <w:r>
-        <w:rPr>
-          <w:b/>
-        </w:rPr>
-        <w:t>ECD reduces violence and builds peace — now with trial evidence from conflict settings.</w:t>
-      </w:r>
-      <w:r>
-        <w:t xml:space="preserve"> Home-visiting and family programmes measurably cut harsh discipline and intimate-partner violence and strengthen the caregiver–child bond in Rwanda, Sierra Leone, Jordan, and Bangladesh.</w:t>
-      </w:r>
-    </w:p>
-    <w:p>
-      <w:pPr>
-        <w:pStyle w:val="ListBullet"/>
-      </w:pPr>
-      <w:r>
-        <w:rPr>
-          <w:b/>
-        </w:rPr>
-        <w:t>It can be delivered affordably, at scale, through existing systems</w:t>
-      </w:r>
-      <w:r>
-        <w:t xml:space="preserve"> — government volunteers, community health workers, phones, and even AI chatbots — at as little as one-fifteenth of historical cost.</w:t>
-      </w:r>
-    </w:p>
-    <w:p>
-      <w:pPr>
-        <w:pStyle w:val="ListBullet"/>
-      </w:pPr>
-      <w:r>
-        <w:rPr>
-          <w:b/>
-        </w:rPr>
-        <w:t>The whole ecosystem matters.</w:t>
-      </w:r>
-      <w:r>
-        <w:t xml:space="preserve"> Engaging fathers and reducing family conflict, not just supporting mothers, drives child outcomes.</w:t>
-      </w:r>
-    </w:p>
-    <w:p>
-      <w:pPr>
-        <w:pStyle w:val="ListBullet"/>
-      </w:pPr>
-      <w:r>
-        <w:rPr>
-          <w:b/>
-        </w:rPr>
-        <w:t>The harm of inaction is now visible in children's biology</w:t>
-      </w:r>
-      <w:r>
-        <w:t xml:space="preserve"> and passes across generations — making early action urgent, not optional.</w:t>
-      </w:r>
-    </w:p>
-    <w:p>
-      <w:pPr>
-        <w:pStyle w:val="ListBullet"/>
-      </w:pPr>
-      <w:r>
-        <w:rPr>
-          <w:b/>
-        </w:rPr>
-        <w:t>The financing gap is the binding constraint.</w:t>
-      </w:r>
-      <w:r>
-        <w:t xml:space="preserve"> Conflict-affected children receive a quarter of the already-inadequate ECCE aid other children get, and child mental health receives under 1% of development assistance.</w:t>
-      </w:r>
-    </w:p>
-    <w:p>
-      <w:pPr>
-        <w:pStyle w:val="ListBullet"/>
-      </w:pPr>
-      <w:r>
-        <w:rPr>
-          <w:b/>
-        </w:rPr>
-        <w:t>Cash alone is not enough</w:t>
-      </w:r>
-      <w:r>
-        <w:t xml:space="preserve"> — investment must fund </w:t>
-      </w:r>
-      <w:r>
-        <w:rPr>
-          <w:i/>
-        </w:rPr>
-        <w:t>services</w:t>
-      </w:r>
-      <w:r>
-        <w:t>, not transfers in isolation.</w:t>
+        <w:t xml:space="preserve"> to change children's lives.</w:t>
       </w:r>
     </w:p>
     <w:p>
@@ -889,19 +621,19 @@
         <w:rPr>
           <w:b/>
         </w:rPr>
-        <w:t>473 million</w:t>
+        <w:t>473 million children</w:t>
       </w:r>
       <w:r>
-        <w:t xml:space="preserve"> children live in fragile and conflict-affected settings; </w:t>
+        <w:t xml:space="preserve"> live in fragile and conflict-affected settings; about </w:t>
       </w:r>
       <w:r>
         <w:rPr>
           <w:b/>
         </w:rPr>
-        <w:t>~1 in 5 children</w:t>
+        <w:t>1 in 5 children</w:t>
       </w:r>
       <w:r>
-        <w:t xml:space="preserve"> globally live in conflict-affected areas (Betancourt et al., 2026; Aber et al., 2025).</w:t>
+        <w:t xml:space="preserve"> worldwide live in a conflict-affected area.</w:t>
       </w:r>
     </w:p>
     <w:p>
@@ -912,10 +644,10 @@
         <w:rPr>
           <w:b/>
         </w:rPr>
-        <w:t>2 of 3</w:t>
+        <w:t>Two of three</w:t>
       </w:r>
       <w:r>
-        <w:t xml:space="preserve"> children under five in LMICs experience corporal punishment (Cuartas, 2023).</w:t>
+        <w:t xml:space="preserve"> young children in lower-income countries are physically punished — with no developmental benefit ever found.</w:t>
       </w:r>
     </w:p>
     <w:p>
@@ -923,16 +655,22 @@
         <w:pStyle w:val="ListBullet"/>
       </w:pPr>
       <w:r>
-        <w:t>Harsh discipline fell by roughly two-thirds (</w:t>
+        <w:t xml:space="preserve">A government-run home-visiting program in Rwanda </w:t>
       </w:r>
       <w:r>
         <w:rPr>
           <w:b/>
         </w:rPr>
-        <w:t>OR = 0.34</w:t>
+        <w:t>sharply reduced harsh punishment</w:t>
       </w:r>
       <w:r>
-        <w:t>) under a government-delivered home-visiting programme in Rwanda (Black et al., 2025).</w:t>
+        <w:t xml:space="preserve"> and can be delivered for </w:t>
+      </w:r>
+      <w:r>
+        <w:rPr>
+          <w:b/>
+        </w:rPr>
+        <w:t>under US$200 per family.</w:t>
       </w:r>
     </w:p>
     <w:p>
@@ -940,16 +678,13 @@
         <w:pStyle w:val="ListBullet"/>
       </w:pPr>
       <w:r>
-        <w:t xml:space="preserve">A refugee parenting programme reached </w:t>
+        <w:t xml:space="preserve">A refugee parenting program in Jordan reached </w:t>
       </w:r>
       <w:r>
         <w:rPr>
           <w:b/>
         </w:rPr>
-        <w:t>2,298 caregivers by phone</w:t>
-      </w:r>
-      <w:r>
-        <w:t xml:space="preserve"> and lowered caregiver depression (Yoshikawa et al., 2024).</w:t>
+        <w:t>nearly 2,300 caregivers by phone.</w:t>
       </w:r>
     </w:p>
     <w:p>
@@ -957,16 +692,16 @@
         <w:pStyle w:val="ListBullet"/>
       </w:pPr>
       <w:r>
-        <w:t xml:space="preserve">A digital parenting tool matched home visits at </w:t>
+        <w:t xml:space="preserve">A digital parenting tool in Peru worked at </w:t>
       </w:r>
       <w:r>
         <w:rPr>
           <w:b/>
         </w:rPr>
-        <w:t>1/15 the cost</w:t>
+        <w:t>one-fifteenth the cost</w:t>
       </w:r>
       <w:r>
-        <w:t xml:space="preserve"> (Cuartas et al., 2026).</w:t>
+        <w:t xml:space="preserve"> of in-person visits.</w:t>
       </w:r>
     </w:p>
     <w:p>
@@ -974,22 +709,22 @@
         <w:pStyle w:val="ListBullet"/>
       </w:pPr>
       <w:r>
-        <w:rPr>
-          <w:b/>
-        </w:rPr>
-        <w:t>43 of 80</w:t>
-      </w:r>
-      <w:r>
-        <w:t xml:space="preserve"> interventions in LMIC/humanitarian settings improved child mental health; only </w:t>
+        <w:t xml:space="preserve">Across </w:t>
       </w:r>
       <w:r>
         <w:rPr>
           <w:b/>
         </w:rPr>
-        <w:t>3</w:t>
+        <w:t>80 studies</w:t>
       </w:r>
       <w:r>
-        <w:t xml:space="preserve"> showed no effect (Betancourt et al., 2024).</w:t>
+        <w:t xml:space="preserve"> in crisis-affected countries, </w:t>
+      </w:r>
+      <w:r>
+        <w:rPr>
+          <w:b/>
+        </w:rPr>
+        <w:t>43 improved children's mental health; only 3 showed no benefit.</w:t>
       </w:r>
     </w:p>
     <w:p>
@@ -1003,10 +738,10 @@
         <w:rPr>
           <w:b/>
         </w:rPr>
-        <w:t>US$0.3 per child</w:t>
+        <w:t>30 cents per child</w:t>
       </w:r>
       <w:r>
-        <w:t xml:space="preserve"> in ECCE aid — a quarter of the amount non-conflict countries receive (Cuartas et al., 2024).</w:t>
+        <w:t xml:space="preserve"> in early-education aid — a quarter of what other children receive.</w:t>
       </w:r>
     </w:p>
     <w:p>
@@ -1017,10 +752,110 @@
         <w:rPr>
           <w:b/>
         </w:rPr>
-        <w:t>&lt;10%</w:t>
+        <w:t>Fewer than 1 in 10</w:t>
       </w:r>
       <w:r>
-        <w:t xml:space="preserve"> of digital mental-health interventions for war-affected youth are developed in the LMICs where war occurs (Leckman et al., 2024).</w:t>
+        <w:t xml:space="preserve"> programs for war-affected children are created where war actually happens.</w:t>
+      </w:r>
+    </w:p>
+    <w:p>
+      <w:pPr>
+        <w:pBdr>
+          <w:bottom w:val="single" w:sz="6" w:space="1" w:color="C9C9C9"/>
+        </w:pBdr>
+        <w:spacing w:after="40"/>
+      </w:pPr>
+    </w:p>
+    <w:p>
+      <w:pPr>
+        <w:pStyle w:val="Heading1"/>
+      </w:pPr>
+      <w:r>
+        <w:t>Key Messages</w:t>
+      </w:r>
+    </w:p>
+    <w:p>
+      <w:pPr>
+        <w:pStyle w:val="ListBullet"/>
+      </w:pPr>
+      <w:r>
+        <w:rPr>
+          <w:b/>
+        </w:rPr>
+        <w:t>Early childhood development reduces violence and builds peace — and we now have proof from the world's hardest places.</w:t>
+      </w:r>
+      <w:r>
+        <w:t xml:space="preserve"> Programs in Rwanda, Jordan, Sierra Leone, and Bangladesh measurably reduce violence in the home and strengthen the bond between children and their caregivers.</w:t>
+      </w:r>
+    </w:p>
+    <w:p>
+      <w:pPr>
+        <w:pStyle w:val="ListBullet"/>
+      </w:pPr>
+      <w:r>
+        <w:rPr>
+          <w:b/>
+        </w:rPr>
+        <w:t>These programs can be delivered affordably, at national scale, and through people communities already trust</w:t>
+      </w:r>
+      <w:r>
+        <w:t xml:space="preserve"> — government volunteers, community health workers, and even mobile phones — at a small fraction of past costs.</w:t>
+      </w:r>
+    </w:p>
+    <w:p>
+      <w:pPr>
+        <w:pStyle w:val="ListBullet"/>
+      </w:pPr>
+      <w:r>
+        <w:rPr>
+          <w:b/>
+        </w:rPr>
+        <w:t>Supporting the whole family matters most.</w:t>
+      </w:r>
+      <w:r>
+        <w:t xml:space="preserve"> Engaging fathers and easing conflict between parents — not supporting mothers alone — is what changes children's lives.</w:t>
+      </w:r>
+    </w:p>
+    <w:p>
+      <w:pPr>
+        <w:pStyle w:val="ListBullet"/>
+      </w:pPr>
+      <w:r>
+        <w:rPr>
+          <w:b/>
+        </w:rPr>
+        <w:t>The cost of inaction is written into children's biology and passed to the next generation.</w:t>
+      </w:r>
+      <w:r>
+        <w:t xml:space="preserve"> Acting early is not optional; it is urgent.</w:t>
+      </w:r>
+    </w:p>
+    <w:p>
+      <w:pPr>
+        <w:pStyle w:val="ListBullet"/>
+      </w:pPr>
+      <w:r>
+        <w:rPr>
+          <w:b/>
+        </w:rPr>
+        <w:t>The children at greatest risk receive the least investment.</w:t>
+      </w:r>
+      <w:r>
+        <w:t xml:space="preserve"> Conflict-affected children get a fraction of the funding other children receive. That must change.</w:t>
+      </w:r>
+    </w:p>
+    <w:p>
+      <w:pPr>
+        <w:pStyle w:val="ListBullet"/>
+      </w:pPr>
+      <w:r>
+        <w:rPr>
+          <w:b/>
+        </w:rPr>
+        <w:t>Cash alone is not enough.</w:t>
+      </w:r>
+      <w:r>
+        <w:t xml:space="preserve"> Investment must reach real services for children and families, not transfers in isolation.</w:t>
       </w:r>
     </w:p>
     <w:p>
@@ -1041,7 +876,7 @@
     </w:p>
     <w:p>
       <w:r>
-        <w:t>Building on the 2023 asks, and sharpened by the new evidence:</w:t>
+        <w:t>Building on our 2023 asks, and strengthened by this new evidence, we call for:</w:t>
       </w:r>
     </w:p>
     <w:p>
@@ -1055,7 +890,7 @@
         <w:t>Recognition.</w:t>
       </w:r>
       <w:r>
-        <w:t xml:space="preserve"> A UN General Assembly Resolution on ECD and Peacebuilding. The evidence base is now mature enough — trial-grade, from conflict settings — to anchor a formal commitment.</w:t>
+        <w:t xml:space="preserve"> A UN General Assembly Resolution on Early Childhood Development and Peacebuilding. The evidence is now strong enough — and drawn from conflict settings themselves — to anchor a formal global commitment.</w:t>
       </w:r>
     </w:p>
     <w:p>
@@ -1066,10 +901,10 @@
         <w:rPr>
           <w:b/>
         </w:rPr>
-        <w:t>Support for Policy and Advocacy.</w:t>
+        <w:t>Policy and Advocacy.</w:t>
       </w:r>
       <w:r>
-        <w:t xml:space="preserve"> Public–private partnerships to operationalise ECD-for-peace policy. Priority: embed proven programmes (e.g., government-delivered home visiting) into national child-protection and education systems, where costs fall and reach grows.</w:t>
+        <w:t xml:space="preserve"> Partnerships between governments, civil society, and the private sector to turn proven programs into national policy — especially by building early childhood services into the government systems where they reach the most children at the lowest cost.</w:t>
       </w:r>
     </w:p>
     <w:p>
@@ -1080,19 +915,10 @@
         <w:rPr>
           <w:b/>
         </w:rPr>
-        <w:t>Support for Research — with a geographic correction.</w:t>
+        <w:t>Research Where It Is Needed.</w:t>
       </w:r>
       <w:r>
-        <w:t xml:space="preserve"> Fewer than 10% of relevant interventions are developed where war actually occurs. New investment must fund </w:t>
-      </w:r>
-      <w:r>
-        <w:rPr>
-          <w:b/>
-        </w:rPr>
-        <w:t>locally-developed research in crisis-affected LMICs</w:t>
-      </w:r>
-      <w:r>
-        <w:t>, including social-cohesion and peacebuilding outcomes and long-term follow-up.</w:t>
+        <w:t xml:space="preserve"> New investment in locally-led research in crisis-affected countries — the places currently producing the least evidence but bearing the greatest need — including research on social cohesion, peacebuilding, and long-term outcomes.</w:t>
       </w:r>
     </w:p>
     <w:p>
@@ -1103,10 +929,10 @@
         <w:rPr>
           <w:b/>
         </w:rPr>
-        <w:t>Support for ECD Services that Promote Peacebuilding.</w:t>
+        <w:t>ECD Services That Build Peace.</w:t>
       </w:r>
       <w:r>
-        <w:t xml:space="preserve"> Scale comprehensive, multi-level services toward 200 million children — leveraging the new low-cost delivery models (non-specialist, remote, and digital) that make this target realistic.</w:t>
+        <w:t xml:space="preserve"> Support to scale comprehensive early childhood services toward our goal of reaching at least 200 million children — using the new, affordable models of delivery that finally make that goal realistic.</w:t>
       </w:r>
     </w:p>
     <w:p>
@@ -1120,25 +946,7 @@
         <w:t>Partnerships and Financing.</w:t>
       </w:r>
       <w:r>
-        <w:t xml:space="preserve"> The binding constraint is money. We ask partners and donors to </w:t>
-      </w:r>
-      <w:r>
-        <w:rPr>
-          <w:b/>
-        </w:rPr>
-        <w:t>raise ECCE's share of education aid toward the 10% minimum and to protect conflict-affected children's share</w:t>
-      </w:r>
-      <w:r>
-        <w:t xml:space="preserve">, and to fund </w:t>
-      </w:r>
-      <w:r>
-        <w:rPr>
-          <w:i/>
-        </w:rPr>
-        <w:t>services</w:t>
-      </w:r>
-      <w:r>
-        <w:t>, not cash transfers alone.</w:t>
+        <w:t xml:space="preserve"> A commitment from donors and partners to raise early childhood's share of education aid toward the recommended minimum, to protect the share reaching conflict-affected children, and to fund services — not cash transfers alone.</w:t>
       </w:r>
     </w:p>
     <w:p>
@@ -1154,61 +962,23 @@
         <w:pStyle w:val="Heading1"/>
       </w:pPr>
       <w:r>
-        <w:t>About this evidence update</w:t>
+        <w:t>The Evidence Behind This Brief</w:t>
       </w:r>
     </w:p>
     <w:p>
       <w:r>
-        <w:t xml:space="preserve">This brief synthesises the </w:t>
-      </w:r>
-      <w:r>
-        <w:rPr>
-          <w:b/>
-        </w:rPr>
-        <w:t>ECPC research repository</w:t>
-      </w:r>
-      <w:r>
-        <w:t xml:space="preserve"> — 103 studies by 25 ECPC-affiliated researchers (2023–2026), each coded from its full text against a 110-field research schema. Flagship findings were selected using a transparent relevance ranking that weights alignment with the ECPC "Peacebuilding through ECD" Theory of Change and crisis-context relevance (50%), evidence rigour (30%), and citation impact among peer-reviewed work (20%); reviews and syntheses without original data are not penalised. The full repository, a top-15 shortlist with the most quotable statistic from each study, and per-study source PDFs are available to the Working Groups (</w:t>
-      </w:r>
-      <w:r>
-        <w:rPr>
-          <w:rFonts w:ascii="Consolas" w:hAnsi="Consolas"/>
-          <w:sz w:val="19"/>
-        </w:rPr>
-        <w:t>07072026ECPCRR.csv</w:t>
-      </w:r>
-      <w:r>
-        <w:t xml:space="preserve">, </w:t>
-      </w:r>
-      <w:r>
-        <w:rPr>
-          <w:rFonts w:ascii="Consolas" w:hAnsi="Consolas"/>
-          <w:sz w:val="19"/>
-        </w:rPr>
-        <w:t>ADVOCACY_SHORTLIST.md</w:t>
-      </w:r>
-      <w:r>
-        <w:t xml:space="preserve">, </w:t>
-      </w:r>
-      <w:r>
-        <w:rPr>
-          <w:rFonts w:ascii="Consolas" w:hAnsi="Consolas"/>
-          <w:sz w:val="19"/>
-        </w:rPr>
-        <w:t>pipeline/ECPC_Repository_for_review.xlsx</w:t>
-      </w:r>
-      <w:r>
-        <w:t>).</w:t>
+        <w:t>This brief draws on the ECPC research repository: 103 studies by 25 ECPC-affiliated researchers, published between 2023 and 2026, each reviewed in full. Flagship findings were chosen for their relevance to the Consortium's "Peacebuilding through Early Childhood Development" framework, the strength of their evidence, and their reach — with reviews and syntheses valued alongside original studies. The full repository and a companion shortlist are available to the Working Groups.</w:t>
       </w:r>
     </w:p>
     <w:p>
       <w:r>
         <w:rPr>
           <w:i/>
-          <w:color w:val="555555"/>
-          <w:sz w:val="20"/>
         </w:rPr>
-        <w:t>Two evidence notes: the network-meta-analysis finding (§5) is drawn from a 2023 BMJ Mental Health study held in the repository under review for author attribution; the Baby's First Years cash-transfer trials (§6) are US-based and are cited only for the "cash-alone-is-insufficient" argument, not as conflict-setting evidence.</w:t>
+        <w:t>Selected sources:</w:t>
+      </w:r>
+      <w:r>
+        <w:t xml:space="preserve"> Aber and colleagues (Niger, 2026; Lebanon, 2023); Betancourt and colleagues (80-study review, 2024; Sierra Leone, 2024; Rwanda cost analysis, 2023); Black and colleagues (Rwanda, 2025; resettled refugees, 2025); Cuartas and colleagues (education financing, 2024; corporal punishment, 2023; digital parenting in Peru, 2026; the economic case, 2024); Hein (peacebuilding policy brief, 2024); Leckman and colleagues (research-gap review, 2024); McCarthy and colleagues (90-study review, 2024); Panter-Brick and colleagues (three-generation study, 2025; fathers and family agreement, 2024); Ponguta and colleagues (Colombia, 2024); and Yoshikawa and colleagues (Jordan, 2024; Bangladesh, 2026).</w:t>
       </w:r>
     </w:p>
     <w:sectPr>

</xml_diff>

<commit_message>
Condense 2026 brief to 2-3 pages, lead with strongest evidence
Cut from ~6 pages to ~2.5 (1,090 words). Folded "Why This Update" into the
opening, dropped the redundant Key Highlights box (numbers retained in body),
and consolidated six evidence themes into the four most compelling: violence
reduction at government scale/low cost (Rwanda), reaching unreachable families
(phone/community/chatbot), the whole family incl. fathers, and the overwhelming
evidence base + cost of delay. Kept the highest-impact figures (30 cents/child,
<1% to mental health, 43 of 80 studies). Regenerated the .docx.

Co-Authored-By: Claude Opus 4.8 <noreply@anthropic.com>
</commit_message>
<xml_diff>
--- a/ECPC_RESEARCH_BRIEF_2026.docx
+++ b/ECPC_RESEARCH_BRIEF_2026.docx
@@ -56,28 +56,7 @@
         <w:t>"Early Childhood Development and Its Promise for Peace."</w:t>
       </w:r>
       <w:r>
-        <w:t xml:space="preserve"> It draws on more than 100 new studies by 25 ECPC-affiliated researchers, published between 2023 and 2026 — many of them carried out in the refugee camps, conflict zones, and fragile states where children need us most. The message is simple: the case for early childhood development as a pathway to peace is no longer only a promise. It is proven.</w:t>
-      </w:r>
-    </w:p>
-    <w:p>
-      <w:pPr>
-        <w:pBdr>
-          <w:bottom w:val="single" w:sz="6" w:space="1" w:color="C9C9C9"/>
-        </w:pBdr>
-        <w:spacing w:after="40"/>
-      </w:pPr>
-    </w:p>
-    <w:p>
-      <w:pPr>
-        <w:pStyle w:val="Heading1"/>
-      </w:pPr>
-      <w:r>
-        <w:t>Why This Update</w:t>
-      </w:r>
-    </w:p>
-    <w:p>
-      <w:r>
-        <w:t>At UNGA-78, the Consortium made a promise-based argument and called for more evidence — "especially in countries experiencing crisis and conflict." That evidence has since arrived. In just three years, ECPC members have completed rigorous studies in Rwanda, Jordan, Sierra Leone, Lebanon, Niger, and the refugee camps of Bangladesh. We can now show, from the settings that matter most, that early childhood development services reduce violence in the home, reach families once thought unreachable, and can be delivered affordably and at national scale. This brief tells that story — and shows why the moment to invest is now.</w:t>
+        <w:t xml:space="preserve"> At UNGA-78 we called for new evidence — "especially in countries experiencing crisis and conflict." It has since arrived. Drawing on more than 100 new studies by 25 ECPC-affiliated researchers, published between 2023 and 2026 — many carried out in the refugee camps, conflict zones, and fragile states where children need us most — this brief carries one message: early childhood development as a pathway to peace is no longer only a promise. It is proven.</w:t>
       </w:r>
     </w:p>
     <w:p>
@@ -104,24 +83,10 @@
         <w:rPr>
           <w:b/>
         </w:rPr>
-        <w:t>one in five children on earth — at least 224 million of school age — live in a conflict-affected area</w:t>
+        <w:t>one in five children on earth live in a conflict-affected area, and an estimated 473 million live in fragile and conflict-affected settings.</w:t>
       </w:r>
       <w:r>
-        <w:t xml:space="preserve">, and an estimated </w:t>
-      </w:r>
-      <w:r>
-        <w:rPr>
-          <w:b/>
-        </w:rPr>
-        <w:t>473 million children live in fragile and conflict-affected settings.</w:t>
-      </w:r>
-      <w:r>
-        <w:t xml:space="preserve"> For these children, the disruption of war and displacement produces "toxic stress" that can derail healthy development and set in motion lifelong cycles of poverty and violence.</w:t>
-      </w:r>
-    </w:p>
-    <w:p>
-      <w:r>
-        <w:t>What the newest research makes painfully clear is how early, and how deeply, that harm begins:</w:t>
+        <w:t xml:space="preserve"> For these children, the upheaval of war and displacement produces "toxic stress" that can derail healthy development and set in motion lifelong cycles of poverty and violence. The newest research shows how early, and how deeply, that harm begins:</w:t>
       </w:r>
     </w:p>
     <w:p>
@@ -141,33 +106,10 @@
         <w:rPr>
           <w:b/>
         </w:rPr>
-        <w:t>two of every three children under the age of five are physically punished.</w:t>
+        <w:t>two of every three children under the age of five are physically punished</w:t>
       </w:r>
       <w:r>
-        <w:t xml:space="preserve"> Where young children are hit, they learn less and develop more slowly — and researchers have found no benefit, ever.</w:t>
-      </w:r>
-    </w:p>
-    <w:p>
-      <w:pPr>
-        <w:pStyle w:val="ListBullet"/>
-      </w:pPr>
-      <w:r>
-        <w:rPr>
-          <w:b/>
-        </w:rPr>
-        <w:t>Caregivers are struggling too.</w:t>
-      </w:r>
-      <w:r>
-        <w:t xml:space="preserve"> In one conflict-affected region of Colombia, </w:t>
-      </w:r>
-      <w:r>
-        <w:rPr>
-          <w:b/>
-        </w:rPr>
-        <w:t>nearly half of caregivers showed signs of depression.</w:t>
-      </w:r>
-      <w:r>
-        <w:t xml:space="preserve"> A child's most important source of protection — a caring adult — is itself under enormous strain.</w:t>
+        <w:t xml:space="preserve"> — and where young children are hit, they learn less and develop more slowly, with no benefit ever found.</w:t>
       </w:r>
     </w:p>
     <w:p>
@@ -210,7 +152,7 @@
         <w:rPr>
           <w:b/>
         </w:rPr>
-        <w:t>conflict-affected countries receive just 30 cents per child each year — a quarter of what children in other countries receive</w:t>
+        <w:t>conflict-affected countries receive just 30 cents per child each year — a quarter of what other children receive</w:t>
       </w:r>
       <w:r>
         <w:t xml:space="preserve"> — and </w:t>
@@ -261,7 +203,7 @@
         <w:t>proof.</w:t>
       </w:r>
       <w:r>
-        <w:t xml:space="preserve"> Six advances stand out.</w:t>
+        <w:t xml:space="preserve"> Four advances stand out.</w:t>
       </w:r>
     </w:p>
     <w:p>
@@ -269,12 +211,12 @@
         <w:pStyle w:val="Heading2"/>
       </w:pPr>
       <w:r>
-        <w:t>1. ECD services reduce violence in the home — and work at national scale</w:t>
+        <w:t>1. Proven to reduce violence — at government scale, and at low cost</w:t>
       </w:r>
     </w:p>
     <w:p>
       <w:r>
-        <w:t xml:space="preserve">The single most important advance is evidence that these programs work when governments deliver them. In Rwanda, a home-visiting program called Sugira Muryango — delivered by government child-protection volunteers — sharply reduced harsh punishment, drew fathers into daily caregiving, and enriched children's learning at home. And it is affordable: about </w:t>
+        <w:t xml:space="preserve">The most important advance is evidence that these programs work when governments deliver them. In Rwanda, a home-visiting program called Sugira Muryango — delivered by government child-protection volunteers — sharply reduced harsh punishment, drew fathers into daily caregiving, and enriched children's learning at home. And it is affordable: about </w:t>
       </w:r>
       <w:r>
         <w:rPr>
@@ -291,26 +233,12 @@
         <w:pStyle w:val="Heading2"/>
       </w:pPr>
       <w:r>
-        <w:t>2. We can now reach families once thought unreachable</w:t>
+        <w:t>2. Reaching families once thought unreachable</w:t>
       </w:r>
     </w:p>
     <w:p>
       <w:r>
-        <w:t>Distance, cost, and a shortage of specialists are no longer barriers.</w:t>
-      </w:r>
-    </w:p>
-    <w:p>
-      <w:pPr>
-        <w:pStyle w:val="ListBullet"/>
-      </w:pPr>
-      <w:r>
-        <w:rPr>
-          <w:b/>
-        </w:rPr>
-        <w:t>By phone:</w:t>
-      </w:r>
-      <w:r>
-        <w:t xml:space="preserve"> A program in Jordan reached </w:t>
+        <w:t xml:space="preserve">Distance, cost, and a shortage of specialists are no longer barriers. A program in Jordan reached </w:t>
       </w:r>
       <w:r>
         <w:rPr>
@@ -319,35 +247,7 @@
         <w:t>nearly 2,300 Syrian and Jordanian refugee caregivers entirely by phone</w:t>
       </w:r>
       <w:r>
-        <w:t>, and eased caregivers' depression.</w:t>
-      </w:r>
-    </w:p>
-    <w:p>
-      <w:pPr>
-        <w:pStyle w:val="ListBullet"/>
-      </w:pPr>
-      <w:r>
-        <w:rPr>
-          <w:b/>
-        </w:rPr>
-        <w:t>Through trusted neighbors:</w:t>
-      </w:r>
-      <w:r>
-        <w:t xml:space="preserve"> In Sierra Leone, community health workers — not specialists — improved the quality of caregiving and reduced violence between parents.</w:t>
-      </w:r>
-    </w:p>
-    <w:p>
-      <w:pPr>
-        <w:pStyle w:val="ListBullet"/>
-      </w:pPr>
-      <w:r>
-        <w:rPr>
-          <w:b/>
-        </w:rPr>
-        <w:t>Through technology:</w:t>
-      </w:r>
-      <w:r>
-        <w:t xml:space="preserve"> In Peru, an AI-guided parenting chatbot supported children's development at </w:t>
+        <w:t xml:space="preserve">, and eased caregivers' depression. In Sierra Leone, community health workers — not specialists — improved the quality of caregiving and reduced violence between parents. And in Peru, an AI-guided parenting chatbot supported children's development at </w:t>
       </w:r>
       <w:r>
         <w:rPr>
@@ -356,12 +256,7 @@
         <w:t>one-fifteenth the cost</w:t>
       </w:r>
       <w:r>
-        <w:t xml:space="preserve"> of in-person home visits.</w:t>
-      </w:r>
-    </w:p>
-    <w:p>
-      <w:r>
-        <w:t>Together these mark a quiet revolution: nurturing care can now reach displaced and remote families at a fraction of the cost once required.</w:t>
+        <w:t xml:space="preserve"> of in-person visits. Nurturing care can now reach displaced and remote families at a fraction of the cost once required.</w:t>
       </w:r>
     </w:p>
     <w:p>
@@ -369,20 +264,12 @@
         <w:pStyle w:val="Heading2"/>
       </w:pPr>
       <w:r>
-        <w:t>3. The whole family matters — especially fathers</w:t>
+        <w:t>3. Supporting the whole family — especially fathers</w:t>
       </w:r>
     </w:p>
     <w:p>
       <w:r>
-        <w:t>The newest research looks beyond mother and child to the entire family.</w:t>
-      </w:r>
-    </w:p>
-    <w:p>
-      <w:pPr>
-        <w:pStyle w:val="ListBullet"/>
-      </w:pPr>
-      <w:r>
-        <w:t xml:space="preserve">Among Syrian refugee families, what mattered most for children was not </w:t>
+        <w:t xml:space="preserve">The newest research looks beyond mother and child to the entire family. Among Syrian refugee families, what mattered most for children was not </w:t>
       </w:r>
       <w:r>
         <w:rPr>
@@ -400,15 +287,7 @@
         <w:t>agreed</w:t>
       </w:r>
       <w:r>
-        <w:t xml:space="preserve"> about it: when mothers and fathers were at odds, children's social and emotional growth suffered.</w:t>
-      </w:r>
-    </w:p>
-    <w:p>
-      <w:pPr>
-        <w:pStyle w:val="ListBullet"/>
-      </w:pPr>
-      <w:r>
-        <w:t xml:space="preserve">In the refugee camps of Cox's Bazar, Bangladesh, a program that engaged </w:t>
+        <w:t xml:space="preserve"> about it — when mothers and fathers were at odds, children's development suffered. In the refugee camps of Cox's Bazar, Bangladesh, a program that engaged </w:t>
       </w:r>
       <w:r>
         <w:rPr>
@@ -417,15 +296,7 @@
         <w:t>more than 2,000 fathers</w:t>
       </w:r>
       <w:r>
-        <w:t xml:space="preserve"> improved their parenting and their children's development.</w:t>
-      </w:r>
-    </w:p>
-    <w:p>
-      <w:pPr>
-        <w:pStyle w:val="ListBullet"/>
-      </w:pPr>
-      <w:r>
-        <w:t>For refugee families resettled in the United States during the pandemic, a family-strengthening program reduced children's behavior problems and helped parents stay closely connected to their children.</w:t>
+        <w:t xml:space="preserve"> improved their parenting and their children's growth. And in Niger, adding simple mindfulness activities to tutoring helped children — refugees and girls most of all — manage sadness and anger, showing that learning programs can help children heal in the middle of crisis.</w:t>
       </w:r>
     </w:p>
     <w:p>
@@ -433,83 +304,10 @@
         <w:pStyle w:val="Heading2"/>
       </w:pPr>
       <w:r>
-        <w:t>4. Learning programs help children heal and focus in the middle of crisis</w:t>
+        <w:t>4. The evidence is now overwhelming — and delay itself harms</w:t>
       </w:r>
     </w:p>
     <w:p>
-      <w:r>
-        <w:t>Social and emotional learning is now among the best-tested tools in education for children affected by conflict.</w:t>
-      </w:r>
-    </w:p>
-    <w:p>
-      <w:pPr>
-        <w:pStyle w:val="ListBullet"/>
-      </w:pPr>
-      <w:r>
-        <w:t xml:space="preserve">In </w:t>
-      </w:r>
-      <w:r>
-        <w:rPr>
-          <w:b/>
-        </w:rPr>
-        <w:t>Niger</w:t>
-      </w:r>
-      <w:r>
-        <w:t xml:space="preserve">, adding simple mindfulness activities to tutoring helped children manage sadness and anger — with </w:t>
-      </w:r>
-      <w:r>
-        <w:rPr>
-          <w:b/>
-        </w:rPr>
-        <w:t>refugee children and girls benefiting most.</w:t>
-      </w:r>
-    </w:p>
-    <w:p>
-      <w:pPr>
-        <w:pStyle w:val="ListBullet"/>
-      </w:pPr>
-      <w:r>
-        <w:t xml:space="preserve">In </w:t>
-      </w:r>
-      <w:r>
-        <w:rPr>
-          <w:b/>
-        </w:rPr>
-        <w:t>Lebanon</w:t>
-      </w:r>
-      <w:r>
-        <w:t>, structured tutoring strengthened children's self-control, though researchers learned an important lesson for program design: longer is not always better.</w:t>
-      </w:r>
-    </w:p>
-    <w:p>
-      <w:pPr>
-        <w:pStyle w:val="ListBullet"/>
-      </w:pPr>
-      <w:r>
-        <w:t xml:space="preserve">A review of </w:t>
-      </w:r>
-      <w:r>
-        <w:rPr>
-          <w:b/>
-        </w:rPr>
-        <w:t>90 studies covering more than 20,000 students</w:t>
-      </w:r>
-      <w:r>
-        <w:t xml:space="preserve"> confirms that school-based social and emotional learning improves both academic and emotional outcomes — and works best when teachers lead it.</w:t>
-      </w:r>
-    </w:p>
-    <w:p>
-      <w:pPr>
-        <w:pStyle w:val="Heading2"/>
-      </w:pPr>
-      <w:r>
-        <w:t>5. The evidence is now overwhelming — but it is not being built where it is needed</w:t>
-      </w:r>
-    </w:p>
-    <w:p>
-      <w:pPr>
-        <w:pStyle w:val="ListBullet"/>
-      </w:pPr>
       <w:r>
         <w:t xml:space="preserve">A review of </w:t>
       </w:r>
@@ -520,24 +318,16 @@
         <w:t>80 studies</w:t>
       </w:r>
       <w:r>
-        <w:t xml:space="preserve"> from low-income and crisis-affected countries found that </w:t>
+        <w:t xml:space="preserve"> from crisis-affected countries found that </w:t>
       </w:r>
       <w:r>
         <w:rPr>
           <w:b/>
         </w:rPr>
-        <w:t>43 improved children's mental health, and only three showed no benefit at all.</w:t>
+        <w:t>43 improved children's mental health, and only three showed no benefit at all</w:t>
       </w:r>
       <w:r>
-        <w:t xml:space="preserve"> The ingredients that worked most often were coaching parents, building communication skills, involving fathers, and delivering care through non-specialists.</w:t>
-      </w:r>
-    </w:p>
-    <w:p>
-      <w:pPr>
-        <w:pStyle w:val="ListBullet"/>
-      </w:pPr>
-      <w:r>
-        <w:t xml:space="preserve">Combining dozens of trials involving </w:t>
+        <w:t xml:space="preserve"> — most often by coaching parents, involving fathers, and delivering care through trusted non-specialists. Combining dozens of trials involving </w:t>
       </w:r>
       <w:r>
         <w:rPr>
@@ -546,7 +336,7 @@
         <w:t>more than 18,000 young children</w:t>
       </w:r>
       <w:r>
-        <w:t xml:space="preserve">, researchers found that helping parents strengthen their bond with their child reduces children's anxiety and withdrawal — and that </w:t>
+        <w:t xml:space="preserve">, researchers found that strengthening the bond between parent and child reduces children's anxiety and withdrawal — and that </w:t>
       </w:r>
       <w:r>
         <w:rPr>
@@ -555,15 +345,7 @@
         <w:t>leaving families waiting for help makes things worse.</w:t>
       </w:r>
       <w:r>
-        <w:t xml:space="preserve"> Delay itself is harmful.</w:t>
-      </w:r>
-    </w:p>
-    <w:p>
-      <w:pPr>
-        <w:pStyle w:val="ListBullet"/>
-      </w:pPr>
-      <w:r>
-        <w:t xml:space="preserve">Yet </w:t>
+        <w:t xml:space="preserve"> Delay itself is harmful. Yet </w:t>
       </w:r>
       <w:r>
         <w:rPr>
@@ -572,190 +354,7 @@
         <w:t>fewer than one in ten</w:t>
       </w:r>
       <w:r>
-        <w:t xml:space="preserve"> of the tools designed to support war-affected children are actually created in the countries where war and displacement occur. Closing this gap is the clearest research priority of the coming decade.</w:t>
-      </w:r>
-    </w:p>
-    <w:p>
-      <w:pPr>
-        <w:pStyle w:val="Heading2"/>
-      </w:pPr>
-      <w:r>
-        <w:t>6. Money matters — but money alone is not enough</w:t>
-      </w:r>
-    </w:p>
-    <w:p>
-      <w:r>
-        <w:t xml:space="preserve">Failing to invest in the years from age two to five carries enormous human and economic costs; providing even one year of quality preschool for every child is expensive, but worth it. At the same time, careful trials in the United States found that giving families cash alone — with no accompanying services — did not measurably improve young children's development. The lesson is not that money doesn't matter, but that </w:t>
-      </w:r>
-      <w:r>
-        <w:rPr>
-          <w:b/>
-        </w:rPr>
-        <w:t>money must be paired with services</w:t>
-      </w:r>
-      <w:r>
-        <w:t xml:space="preserve"> to change children's lives.</w:t>
-      </w:r>
-    </w:p>
-    <w:p>
-      <w:pPr>
-        <w:pBdr>
-          <w:bottom w:val="single" w:sz="6" w:space="1" w:color="C9C9C9"/>
-        </w:pBdr>
-        <w:spacing w:after="40"/>
-      </w:pPr>
-    </w:p>
-    <w:p>
-      <w:pPr>
-        <w:pStyle w:val="Heading1"/>
-      </w:pPr>
-      <w:r>
-        <w:t>Key Highlights</w:t>
-      </w:r>
-    </w:p>
-    <w:p>
-      <w:pPr>
-        <w:pStyle w:val="ListBullet"/>
-      </w:pPr>
-      <w:r>
-        <w:rPr>
-          <w:b/>
-        </w:rPr>
-        <w:t>473 million children</w:t>
-      </w:r>
-      <w:r>
-        <w:t xml:space="preserve"> live in fragile and conflict-affected settings; about </w:t>
-      </w:r>
-      <w:r>
-        <w:rPr>
-          <w:b/>
-        </w:rPr>
-        <w:t>1 in 5 children</w:t>
-      </w:r>
-      <w:r>
-        <w:t xml:space="preserve"> worldwide live in a conflict-affected area.</w:t>
-      </w:r>
-    </w:p>
-    <w:p>
-      <w:pPr>
-        <w:pStyle w:val="ListBullet"/>
-      </w:pPr>
-      <w:r>
-        <w:rPr>
-          <w:b/>
-        </w:rPr>
-        <w:t>Two of three</w:t>
-      </w:r>
-      <w:r>
-        <w:t xml:space="preserve"> young children in lower-income countries are physically punished — with no developmental benefit ever found.</w:t>
-      </w:r>
-    </w:p>
-    <w:p>
-      <w:pPr>
-        <w:pStyle w:val="ListBullet"/>
-      </w:pPr>
-      <w:r>
-        <w:t xml:space="preserve">A government-run home-visiting program in Rwanda </w:t>
-      </w:r>
-      <w:r>
-        <w:rPr>
-          <w:b/>
-        </w:rPr>
-        <w:t>sharply reduced harsh punishment</w:t>
-      </w:r>
-      <w:r>
-        <w:t xml:space="preserve"> and can be delivered for </w:t>
-      </w:r>
-      <w:r>
-        <w:rPr>
-          <w:b/>
-        </w:rPr>
-        <w:t>under US$200 per family.</w:t>
-      </w:r>
-    </w:p>
-    <w:p>
-      <w:pPr>
-        <w:pStyle w:val="ListBullet"/>
-      </w:pPr>
-      <w:r>
-        <w:t xml:space="preserve">A refugee parenting program in Jordan reached </w:t>
-      </w:r>
-      <w:r>
-        <w:rPr>
-          <w:b/>
-        </w:rPr>
-        <w:t>nearly 2,300 caregivers by phone.</w:t>
-      </w:r>
-    </w:p>
-    <w:p>
-      <w:pPr>
-        <w:pStyle w:val="ListBullet"/>
-      </w:pPr>
-      <w:r>
-        <w:t xml:space="preserve">A digital parenting tool in Peru worked at </w:t>
-      </w:r>
-      <w:r>
-        <w:rPr>
-          <w:b/>
-        </w:rPr>
-        <w:t>one-fifteenth the cost</w:t>
-      </w:r>
-      <w:r>
-        <w:t xml:space="preserve"> of in-person visits.</w:t>
-      </w:r>
-    </w:p>
-    <w:p>
-      <w:pPr>
-        <w:pStyle w:val="ListBullet"/>
-      </w:pPr>
-      <w:r>
-        <w:t xml:space="preserve">Across </w:t>
-      </w:r>
-      <w:r>
-        <w:rPr>
-          <w:b/>
-        </w:rPr>
-        <w:t>80 studies</w:t>
-      </w:r>
-      <w:r>
-        <w:t xml:space="preserve"> in crisis-affected countries, </w:t>
-      </w:r>
-      <w:r>
-        <w:rPr>
-          <w:b/>
-        </w:rPr>
-        <w:t>43 improved children's mental health; only 3 showed no benefit.</w:t>
-      </w:r>
-    </w:p>
-    <w:p>
-      <w:pPr>
-        <w:pStyle w:val="ListBullet"/>
-      </w:pPr>
-      <w:r>
-        <w:t xml:space="preserve">Conflict-affected countries receive just </w:t>
-      </w:r>
-      <w:r>
-        <w:rPr>
-          <w:b/>
-        </w:rPr>
-        <w:t>30 cents per child</w:t>
-      </w:r>
-      <w:r>
-        <w:t xml:space="preserve"> in early-education aid — a quarter of what other children receive.</w:t>
-      </w:r>
-    </w:p>
-    <w:p>
-      <w:pPr>
-        <w:pStyle w:val="ListBullet"/>
-      </w:pPr>
-      <w:r>
-        <w:rPr>
-          <w:b/>
-        </w:rPr>
-        <w:t>Fewer than 1 in 10</w:t>
-      </w:r>
-      <w:r>
-        <w:t xml:space="preserve"> programs for war-affected children are created where war actually happens.</w:t>
+        <w:t xml:space="preserve"> of the tools designed for war-affected children are created in the countries where war actually occurs. Closing that gap is the clearest priority of the coming decade.</w:t>
       </w:r>
     </w:p>
     <w:p>
@@ -784,9 +383,6 @@
         </w:rPr>
         <w:t>Early childhood development reduces violence and builds peace — and we now have proof from the world's hardest places.</w:t>
       </w:r>
-      <w:r>
-        <w:t xml:space="preserve"> Programs in Rwanda, Jordan, Sierra Leone, and Bangladesh measurably reduce violence in the home and strengthen the bond between children and their caregivers.</w:t>
-      </w:r>
     </w:p>
     <w:p>
       <w:pPr>
@@ -799,7 +395,7 @@
         <w:t>These programs can be delivered affordably, at national scale, and through people communities already trust</w:t>
       </w:r>
       <w:r>
-        <w:t xml:space="preserve"> — government volunteers, community health workers, and even mobile phones — at a small fraction of past costs.</w:t>
+        <w:t xml:space="preserve"> — government volunteers, community health workers, and even mobile phones.</w:t>
       </w:r>
     </w:p>
     <w:p>
@@ -810,10 +406,7 @@
         <w:rPr>
           <w:b/>
         </w:rPr>
-        <w:t>Supporting the whole family matters most.</w:t>
-      </w:r>
-      <w:r>
-        <w:t xml:space="preserve"> Engaging fathers and easing conflict between parents — not supporting mothers alone — is what changes children's lives.</w:t>
+        <w:t>Supporting the whole family — fathers included — is what changes children's lives.</w:t>
       </w:r>
     </w:p>
     <w:p>
@@ -838,24 +431,7 @@
         <w:rPr>
           <w:b/>
         </w:rPr>
-        <w:t>The children at greatest risk receive the least investment.</w:t>
-      </w:r>
-      <w:r>
-        <w:t xml:space="preserve"> Conflict-affected children get a fraction of the funding other children receive. That must change.</w:t>
-      </w:r>
-    </w:p>
-    <w:p>
-      <w:pPr>
-        <w:pStyle w:val="ListBullet"/>
-      </w:pPr>
-      <w:r>
-        <w:rPr>
-          <w:b/>
-        </w:rPr>
-        <w:t>Cash alone is not enough.</w:t>
-      </w:r>
-      <w:r>
-        <w:t xml:space="preserve"> Investment must reach real services for children and families, not transfers in isolation.</w:t>
+        <w:t>The children at greatest risk receive the least investment. That must change.</w:t>
       </w:r>
     </w:p>
     <w:p>
@@ -875,11 +451,6 @@
       </w:r>
     </w:p>
     <w:p>
-      <w:r>
-        <w:t>Building on our 2023 asks, and strengthened by this new evidence, we call for:</w:t>
-      </w:r>
-    </w:p>
-    <w:p>
       <w:pPr>
         <w:pStyle w:val="ListNumber"/>
       </w:pPr>
@@ -890,7 +461,7 @@
         <w:t>Recognition.</w:t>
       </w:r>
       <w:r>
-        <w:t xml:space="preserve"> A UN General Assembly Resolution on Early Childhood Development and Peacebuilding. The evidence is now strong enough — and drawn from conflict settings themselves — to anchor a formal global commitment.</w:t>
+        <w:t xml:space="preserve"> A UN General Assembly Resolution on Early Childhood Development and Peacebuilding — the evidence is now strong enough, and drawn from conflict settings themselves, to anchor a formal global commitment.</w:t>
       </w:r>
     </w:p>
     <w:p>
@@ -904,7 +475,7 @@
         <w:t>Policy and Advocacy.</w:t>
       </w:r>
       <w:r>
-        <w:t xml:space="preserve"> Partnerships between governments, civil society, and the private sector to turn proven programs into national policy — especially by building early childhood services into the government systems where they reach the most children at the lowest cost.</w:t>
+        <w:t xml:space="preserve"> Partnerships to build proven early childhood programs into the government systems where they reach the most children at the lowest cost.</w:t>
       </w:r>
     </w:p>
     <w:p>
@@ -918,7 +489,7 @@
         <w:t>Research Where It Is Needed.</w:t>
       </w:r>
       <w:r>
-        <w:t xml:space="preserve"> New investment in locally-led research in crisis-affected countries — the places currently producing the least evidence but bearing the greatest need — including research on social cohesion, peacebuilding, and long-term outcomes.</w:t>
+        <w:t xml:space="preserve"> Investment in locally-led research in crisis-affected countries — the places producing the least evidence but bearing the greatest need.</w:t>
       </w:r>
     </w:p>
     <w:p>
@@ -932,7 +503,7 @@
         <w:t>ECD Services That Build Peace.</w:t>
       </w:r>
       <w:r>
-        <w:t xml:space="preserve"> Support to scale comprehensive early childhood services toward our goal of reaching at least 200 million children — using the new, affordable models of delivery that finally make that goal realistic.</w:t>
+        <w:t xml:space="preserve"> Support to scale comprehensive services toward our goal of reaching at least 200 million children, using the new, affordable models that finally make it realistic.</w:t>
       </w:r>
     </w:p>
     <w:p>
@@ -946,7 +517,7 @@
         <w:t>Partnerships and Financing.</w:t>
       </w:r>
       <w:r>
-        <w:t xml:space="preserve"> A commitment from donors and partners to raise early childhood's share of education aid toward the recommended minimum, to protect the share reaching conflict-affected children, and to fund services — not cash transfers alone.</w:t>
+        <w:t xml:space="preserve"> A commitment to raise early childhood's share of education aid, protect the share reaching conflict-affected children, and fund real services — not cash transfers alone.</w:t>
       </w:r>
     </w:p>
     <w:p>
@@ -958,27 +529,13 @@
       </w:pPr>
     </w:p>
     <w:p>
-      <w:pPr>
-        <w:pStyle w:val="Heading1"/>
-      </w:pPr>
-      <w:r>
-        <w:t>The Evidence Behind This Brief</w:t>
-      </w:r>
-    </w:p>
-    <w:p>
-      <w:r>
-        <w:t>This brief draws on the ECPC research repository: 103 studies by 25 ECPC-affiliated researchers, published between 2023 and 2026, each reviewed in full. Flagship findings were chosen for their relevance to the Consortium's "Peacebuilding through Early Childhood Development" framework, the strength of their evidence, and their reach — with reviews and syntheses valued alongside original studies. The full repository and a companion shortlist are available to the Working Groups.</w:t>
-      </w:r>
-    </w:p>
-    <w:p>
       <w:r>
         <w:rPr>
           <w:i/>
+          <w:color w:val="555555"/>
+          <w:sz w:val="20"/>
         </w:rPr>
-        <w:t>Selected sources:</w:t>
-      </w:r>
-      <w:r>
-        <w:t xml:space="preserve"> Aber and colleagues (Niger, 2026; Lebanon, 2023); Betancourt and colleagues (80-study review, 2024; Sierra Leone, 2024; Rwanda cost analysis, 2023); Black and colleagues (Rwanda, 2025; resettled refugees, 2025); Cuartas and colleagues (education financing, 2024; corporal punishment, 2023; digital parenting in Peru, 2026; the economic case, 2024); Hein (peacebuilding policy brief, 2024); Leckman and colleagues (research-gap review, 2024); McCarthy and colleagues (90-study review, 2024); Panter-Brick and colleagues (three-generation study, 2025; fathers and family agreement, 2024); Ponguta and colleagues (Colombia, 2024); and Yoshikawa and colleagues (Jordan, 2024; Bangladesh, 2026).</w:t>
+        <w:t>This brief draws on the ECPC research repository: 103 studies by 25 ECPC-affiliated researchers (2023–2026), each reviewed in full and prioritized for relevance to peacebuilding, strength of evidence, and reach. The full repository and a companion shortlist of sources are available to the Working Groups.</w:t>
       </w:r>
     </w:p>
     <w:sectPr>

</xml_diff>